<commit_message>
Set Japanese characters upright in vertical cells and text boxes
A fourth sdkjs patch: tbRl table cells and eaVert shapes keep laying
their text out as turned lines, and the characters that stand upright
in vertical text (UAX #50 U and Tu) are drawn turned back about the
centre of their em square; the comma and the full stop move to the
top right. Brackets, dashes, the prolonged sound mark and Latin text
stay turned. Checked by printing the cell and text box tests with the
patched package and on its screen; the sdkjs layout and table tests
pass on both ONLYOFFICE and Euro-Office.

The node QUnit shim now exposes QUnit.assert, which two table tests use.

Co-Authored-By: Claude Opus 5.5 <noreply@anthropic.com>
</commit_message>
<xml_diff>
--- a/docs/sekkei/euro-office-nihongo/05-vertical-cell.docx
+++ b/docs/sekkei/euro-office-nihongo/05-vertical-cell.docx
@@ -1,6 +1,6 @@
 
 <file path=word/document.xml><?xml version="1.0" encoding="utf-8"?>
-<w:document xmlns:w="http://schemas.openxmlformats.org/wordprocessingml/2006/main">
+<w:document xmlns:w="http://schemas.openxmlformats.org/wordprocessingml/2006/main" xmlns:wp="http://schemas.openxmlformats.org/drawingml/2006/wordprocessingDrawing" xmlns:wps="http://schemas.microsoft.com/office/word/2010/wordprocessingShape">
   <w:body>
     <w:tbl>
       <w:tblPr>
@@ -31,7 +31,7 @@
                 <w:sz w:val="21"/>
                 <w:szCs w:val="21"/>
               </w:rPr>
-              <w:t xml:space="preserve">縦書きＡＢ「題」</w:t>
+              <w:t xml:space="preserve">縦書きＡＢ「題」、ー。abc</w:t>
             </w:r>
           </w:p>
         </w:tc>

</xml_diff>